<commit_message>
refactor: enriquecer contextos das avaliacoes 03 e 04 com situacoes realistas
- AVALIACAO-03: TechBrazil (e-commerce, Sao Paulo) - Comissoes de Vendedores
- AVALIACAO-04: MegaStore Brasil (varejo, SC) - Dashboard KPIs
- Scripts: ajustar_bordas.py, regenerar_avaliacoes.py

Co-Authored-By: Claude Haiku 4.5 <noreply@anthropic.com>
</commit_message>
<xml_diff>
--- a/MATERIAIS/GESTAO_E_CONTROLE_MATERIAIS/ANALISE_DADOS_APLICADA_GESTAO/ATIVIDADES/AVALIACAO-03-FUNCOES-DE-BUSCA-AVANCADAS.docx
+++ b/MATERIAIS/GESTAO_E_CONTROLE_MATERIAIS/ANALISE_DADOS_APLICADA_GESTAO/ATIVIDADES/AVALIACAO-03-FUNCOES-DE-BUSCA-AVANCADAS.docx
@@ -70,101 +70,45 @@
             <w:pPr>
               <w:jc w:val="center"/>
             </w:pPr>
-            <w:r/>
             <w:r>
               <w:rPr>
                 <w:b/>
-                <w:sz w:val="28"/>
+                <w:sz w:val="26"/>
               </w:rPr>
-              <w:t>AVALIAÇÃO OBJETIVA</w:t>
+              <w:t>AVALIACAO-03</w:t>
+            </w:r>
+          </w:p>
+          <w:p/>
+          <w:p/>
+          <w:p/>
+          <w:p/>
+          <w:p/>
+          <w:p/>
+          <w:p>
+            <w:r>
+              <w:rPr>
+                <w:sz w:val="22"/>
+              </w:rPr>
+              <w:t>TechBrazil - Sao Paulo</w:t>
             </w:r>
           </w:p>
           <w:p>
             <w:r>
               <w:rPr>
-                <w:i/>
-                <w:color w:val="004284"/>
+                <w:sz w:val="20"/>
               </w:rPr>
-              <w:t xml:space="preserve">Data: </w:t>
-            </w:r>
-            <w:r>
-              <w:t>_____________________</w:t>
-            </w:r>
-          </w:p>
-          <w:p>
-            <w:r>
-              <w:rPr>
-                <w:i/>
-                <w:color w:val="004284"/>
-              </w:rPr>
-              <w:t xml:space="preserve">Docente: </w:t>
-            </w:r>
-            <w:r>
-              <w:rPr>
-                <w:i/>
-                <w:color w:val="004284"/>
-              </w:rPr>
-              <w:t>GELVAZIO CAMARGO</w:t>
-            </w:r>
-          </w:p>
-          <w:p>
-            <w:r>
-              <w:rPr>
-                <w:i/>
-                <w:color w:val="004284"/>
-              </w:rPr>
-              <w:t xml:space="preserve">Curso Técnico em </w:t>
-            </w:r>
-            <w:r>
-              <w:rPr>
-                <w:i/>
-                <w:color w:val="004284"/>
-              </w:rPr>
-              <w:t>Assistente em Processos de Gestão e Controle de Materiais</w:t>
-            </w:r>
-          </w:p>
-          <w:p>
-            <w:r>
-              <w:rPr>
-                <w:i/>
-                <w:color w:val="004284"/>
-              </w:rPr>
-              <w:t xml:space="preserve">Unidade Curricular: </w:t>
-            </w:r>
-            <w:r>
-              <w:rPr>
-                <w:i/>
-                <w:color w:val="004284"/>
-              </w:rPr>
-              <w:t>Análise de Dados Aplicada à Gestão</w:t>
-            </w:r>
-          </w:p>
-          <w:p>
-            <w:r>
-              <w:rPr>
-                <w:i/>
-                <w:color w:val="004284"/>
-              </w:rPr>
-              <w:t xml:space="preserve">Turma: </w:t>
-            </w:r>
-            <w:r>
-              <w:rPr>
-                <w:i/>
-                <w:color w:val="004284"/>
-              </w:rPr>
-              <w:t>AI AIAC 2026/2 V1</w:t>
-            </w:r>
-          </w:p>
-          <w:p>
-            <w:r>
-              <w:rPr>
-                <w:i/>
-                <w:color w:val="004284"/>
-              </w:rPr>
-              <w:t xml:space="preserve">Estudante: </w:t>
-            </w:r>
-            <w:r>
-              <w:t>_____________________</w:t>
+              <w:t>Voce trabalha no RH da TechBrazil, empresa de e-commerce em SP.</w:t>
+              <w:br/>
+              <w:t>Precisa criar relatorio mensal de comissoes cruzando dados de:</w:t>
+              <w:br/>
+              <w:t>- Vendedores: ID, Nome, Salario Base, Departamento</w:t>
+              <w:br/>
+              <w:t>- Faturamento: ID, Mes, Valor Faturado</w:t>
+              <w:br/>
+              <w:t>- Comissoes: Faixas de faturamento com taxas (3%, 5%, 8%)</w:t>
+              <w:br/>
+              <w:br/>
+              <w:t>Use PROCV, INDICE/CORRESPONDENCIA e SE aninhado para calcular comissoes.</w:t>
             </w:r>
           </w:p>
         </w:tc>

</xml_diff>